<commit_message>
fix: correcion en los templates de la aplicación
</commit_message>
<xml_diff>
--- a/backend/apps/operaciones/templates/Proios_Quotation_Productos_TEMPLATE_EN.docx
+++ b/backend/apps/operaciones/templates/Proios_Quotation_Productos_TEMPLATE_EN.docx
@@ -1,6 +1,6 @@
 
 <file path=word/document.xml><?xml version="1.0" encoding="utf-8"?>
-<w:document xmlns:wpc="http://schemas.microsoft.com/office/word/2010/wordprocessingCanvas" xmlns:cx="http://schemas.microsoft.com/office/drawing/2014/chartex" xmlns:cx1="http://schemas.microsoft.com/office/drawing/2015/9/8/chartex" xmlns:cx2="http://schemas.microsoft.com/office/drawing/2015/10/21/chartex" xmlns:cx3="http://schemas.microsoft.com/office/drawing/2016/5/9/chartex" xmlns:cx4="http://schemas.microsoft.com/office/drawing/2016/5/10/chartex" xmlns:cx5="http://schemas.microsoft.com/office/drawing/2016/5/11/chartex" xmlns:cx6="http://schemas.microsoft.com/office/drawing/2016/5/12/chartex" xmlns:cx7="http://schemas.microsoft.com/office/drawing/2016/5/13/chartex" xmlns:cx8="http://schemas.microsoft.com/office/drawing/2016/5/14/chartex" xmlns:mc="http://schemas.openxmlformats.org/markup-compatibility/2006" xmlns:aink="http://schemas.microsoft.com/office/drawing/2016/ink" xmlns:am3d="http://schemas.microsoft.com/office/drawing/2017/model3d" xmlns:o="urn:schemas-microsoft-com:office:office" xmlns:r="http://schemas.openxmlformats.org/officeDocument/2006/relationships" xmlns:m="http://schemas.openxmlformats.org/officeDocument/2006/math" xmlns:v="urn:schemas-microsoft-com:vml" xmlns:wp14="http://schemas.microsoft.com/office/word/2010/wordprocessingDrawing" xmlns:wp="http://schemas.openxmlformats.org/drawingml/2006/wordprocessingDrawing" xmlns:w10="urn:schemas-microsoft-com:office:word" xmlns:w="http://schemas.openxmlformats.org/wordprocessingml/2006/main" xmlns:w14="http://schemas.microsoft.com/office/word/2010/wordml" xmlns:w15="http://schemas.microsoft.com/office/word/2012/wordml" xmlns:w16cex="http://schemas.microsoft.com/office/word/2018/wordml/cex" xmlns:w16cid="http://schemas.microsoft.com/office/word/2016/wordml/cid" xmlns:w16="http://schemas.microsoft.com/office/word/2018/wordml" xmlns:w16sdtdh="http://schemas.microsoft.com/office/word/2020/wordml/sdtdatahash" xmlns:w16se="http://schemas.microsoft.com/office/word/2015/wordml/symex" xmlns:wpg="http://schemas.microsoft.com/office/word/2010/wordprocessingGroup" xmlns:wpi="http://schemas.microsoft.com/office/word/2010/wordprocessingInk" xmlns:wne="http://schemas.microsoft.com/office/word/2006/wordml" xmlns:wps="http://schemas.microsoft.com/office/word/2010/wordprocessingShape" mc:Ignorable="w14 w15 w16se w16cid w16 w16cex w16sdtdh wp14">
+<w:document xmlns:wpc="http://schemas.microsoft.com/office/word/2010/wordprocessingCanvas" xmlns:cx="http://schemas.microsoft.com/office/drawing/2014/chartex" xmlns:cx1="http://schemas.microsoft.com/office/drawing/2015/9/8/chartex" xmlns:cx2="http://schemas.microsoft.com/office/drawing/2015/10/21/chartex" xmlns:cx3="http://schemas.microsoft.com/office/drawing/2016/5/9/chartex" xmlns:cx4="http://schemas.microsoft.com/office/drawing/2016/5/10/chartex" xmlns:cx5="http://schemas.microsoft.com/office/drawing/2016/5/11/chartex" xmlns:cx6="http://schemas.microsoft.com/office/drawing/2016/5/12/chartex" xmlns:cx7="http://schemas.microsoft.com/office/drawing/2016/5/13/chartex" xmlns:cx8="http://schemas.microsoft.com/office/drawing/2016/5/14/chartex" xmlns:mc="http://schemas.openxmlformats.org/markup-compatibility/2006" xmlns:aink="http://schemas.microsoft.com/office/drawing/2016/ink" xmlns:am3d="http://schemas.microsoft.com/office/drawing/2017/model3d" xmlns:o="urn:schemas-microsoft-com:office:office" xmlns:oel="http://schemas.microsoft.com/office/2019/extlst" xmlns:r="http://schemas.openxmlformats.org/officeDocument/2006/relationships" xmlns:m="http://schemas.openxmlformats.org/officeDocument/2006/math" xmlns:v="urn:schemas-microsoft-com:vml" xmlns:wp14="http://schemas.microsoft.com/office/word/2010/wordprocessingDrawing" xmlns:wp="http://schemas.openxmlformats.org/drawingml/2006/wordprocessingDrawing" xmlns:w10="urn:schemas-microsoft-com:office:word" xmlns:w="http://schemas.openxmlformats.org/wordprocessingml/2006/main" xmlns:w14="http://schemas.microsoft.com/office/word/2010/wordml" xmlns:w15="http://schemas.microsoft.com/office/word/2012/wordml" xmlns:w16cex="http://schemas.microsoft.com/office/word/2018/wordml/cex" xmlns:w16cid="http://schemas.microsoft.com/office/word/2016/wordml/cid" xmlns:w16="http://schemas.microsoft.com/office/word/2018/wordml" xmlns:w16du="http://schemas.microsoft.com/office/word/2023/wordml/word16du" xmlns:w16sdtdh="http://schemas.microsoft.com/office/word/2020/wordml/sdtdatahash" xmlns:w16sdtfl="http://schemas.microsoft.com/office/word/2024/wordml/sdtformatlock" xmlns:w16se="http://schemas.microsoft.com/office/word/2015/wordml/symex" xmlns:wpg="http://schemas.microsoft.com/office/word/2010/wordprocessingGroup" xmlns:wpi="http://schemas.microsoft.com/office/word/2010/wordprocessingInk" xmlns:wne="http://schemas.microsoft.com/office/word/2006/wordml" xmlns:wps="http://schemas.microsoft.com/office/word/2010/wordprocessingShape" mc:Ignorable="w14 w15 w16se w16cid w16 w16cex w16sdtdh w16sdtfl w16du wp14">
   <w:body>
     <w:p>
       <w:pPr>
@@ -183,11 +183,39 @@
                 <w:rFonts w:ascii="Tahoma" w:hAnsi="Tahoma" w:cs="Tahoma"/>
               </w:rPr>
             </w:pPr>
-            <w:r>
-              <w:rPr>
-                <w:rFonts w:ascii="Tahoma" w:hAnsi="Tahoma" w:cs="Tahoma"/>
-              </w:rPr>
-              <w:t>Attn: {{atencion}}</w:t>
+            <w:proofErr w:type="spellStart"/>
+            <w:r>
+              <w:rPr>
+                <w:rFonts w:ascii="Tahoma" w:hAnsi="Tahoma" w:cs="Tahoma"/>
+              </w:rPr>
+              <w:t>Attn</w:t>
+            </w:r>
+            <w:proofErr w:type="spellEnd"/>
+            <w:r>
+              <w:rPr>
+                <w:rFonts w:ascii="Tahoma" w:hAnsi="Tahoma" w:cs="Tahoma"/>
+              </w:rPr>
+              <w:t xml:space="preserve">: </w:t>
+            </w:r>
+            <w:r>
+              <w:rPr>
+                <w:rFonts w:ascii="Tahoma" w:hAnsi="Tahoma" w:cs="Tahoma"/>
+              </w:rPr>
+              <w:t>{{</w:t>
+            </w:r>
+            <w:proofErr w:type="spellStart"/>
+            <w:r>
+              <w:rPr>
+                <w:rFonts w:ascii="Tahoma" w:hAnsi="Tahoma" w:cs="Tahoma"/>
+              </w:rPr>
+              <w:t>atencion</w:t>
+            </w:r>
+            <w:proofErr w:type="spellEnd"/>
+            <w:r>
+              <w:rPr>
+                <w:rFonts w:ascii="Tahoma" w:hAnsi="Tahoma" w:cs="Tahoma"/>
+              </w:rPr>
+              <w:t>}}</w:t>
             </w:r>
           </w:p>
         </w:tc>
@@ -258,7 +286,23 @@
                 <w:rFonts w:ascii="Tahoma" w:hAnsi="Tahoma" w:cs="Tahoma"/>
                 <w:lang w:val="en-US"/>
               </w:rPr>
-              <w:t>Date  {{fecha}}</w:t>
+              <w:t>Date  {{</w:t>
+            </w:r>
+            <w:proofErr w:type="spellStart"/>
+            <w:r>
+              <w:rPr>
+                <w:rFonts w:ascii="Tahoma" w:hAnsi="Tahoma" w:cs="Tahoma"/>
+                <w:lang w:val="en-US"/>
+              </w:rPr>
+              <w:t>fecha</w:t>
+            </w:r>
+            <w:proofErr w:type="spellEnd"/>
+            <w:r>
+              <w:rPr>
+                <w:rFonts w:ascii="Tahoma" w:hAnsi="Tahoma" w:cs="Tahoma"/>
+                <w:lang w:val="en-US"/>
+              </w:rPr>
+              <w:t>}}</w:t>
             </w:r>
           </w:p>
           <w:p>
@@ -274,7 +318,23 @@
                 <w:rFonts w:ascii="Tahoma" w:hAnsi="Tahoma" w:cs="Tahoma"/>
                 <w:lang w:val="en-US"/>
               </w:rPr>
-              <w:t>Valid  {{validez}}</w:t>
+              <w:t>Valid  {{</w:t>
+            </w:r>
+            <w:proofErr w:type="spellStart"/>
+            <w:r>
+              <w:rPr>
+                <w:rFonts w:ascii="Tahoma" w:hAnsi="Tahoma" w:cs="Tahoma"/>
+                <w:lang w:val="en-US"/>
+              </w:rPr>
+              <w:t>validez</w:t>
+            </w:r>
+            <w:proofErr w:type="spellEnd"/>
+            <w:r>
+              <w:rPr>
+                <w:rFonts w:ascii="Tahoma" w:hAnsi="Tahoma" w:cs="Tahoma"/>
+                <w:lang w:val="en-US"/>
+              </w:rPr>
+              <w:t>}}</w:t>
             </w:r>
           </w:p>
           <w:p>
@@ -297,7 +357,23 @@
                 <w:rFonts w:ascii="Tahoma" w:eastAsia="Consolas" w:hAnsi="Tahoma" w:cs="Tahoma"/>
                 <w:lang w:val="en-US"/>
               </w:rPr>
-              <w:t>{{buque}}</w:t>
+              <w:t>{{</w:t>
+            </w:r>
+            <w:proofErr w:type="spellStart"/>
+            <w:r>
+              <w:rPr>
+                <w:rFonts w:ascii="Tahoma" w:eastAsia="Consolas" w:hAnsi="Tahoma" w:cs="Tahoma"/>
+                <w:lang w:val="en-US"/>
+              </w:rPr>
+              <w:t>buque</w:t>
+            </w:r>
+            <w:proofErr w:type="spellEnd"/>
+            <w:r>
+              <w:rPr>
+                <w:rFonts w:ascii="Tahoma" w:eastAsia="Consolas" w:hAnsi="Tahoma" w:cs="Tahoma"/>
+                <w:lang w:val="en-US"/>
+              </w:rPr>
+              <w:t>}}</w:t>
             </w:r>
           </w:p>
           <w:p>
@@ -308,6 +384,7 @@
                 <w:lang w:val="en-GB"/>
               </w:rPr>
             </w:pPr>
+            <w:proofErr w:type="gramStart"/>
             <w:r>
               <w:rPr>
                 <w:rFonts w:ascii="Tahoma" w:hAnsi="Tahoma" w:cs="Tahoma"/>
@@ -320,7 +397,31 @@
                 <w:rFonts w:ascii="Tahoma" w:eastAsia="Consolas" w:hAnsi="Tahoma" w:cs="Tahoma"/>
                 <w:lang w:val="en-GB"/>
               </w:rPr>
-              <w:t>{{ubicacion}}</w:t>
+              <w:t>{</w:t>
+            </w:r>
+            <w:proofErr w:type="gramEnd"/>
+            <w:r>
+              <w:rPr>
+                <w:rFonts w:ascii="Tahoma" w:eastAsia="Consolas" w:hAnsi="Tahoma" w:cs="Tahoma"/>
+                <w:lang w:val="en-GB"/>
+              </w:rPr>
+              <w:t>{</w:t>
+            </w:r>
+            <w:proofErr w:type="spellStart"/>
+            <w:r>
+              <w:rPr>
+                <w:rFonts w:ascii="Tahoma" w:eastAsia="Consolas" w:hAnsi="Tahoma" w:cs="Tahoma"/>
+                <w:lang w:val="en-GB"/>
+              </w:rPr>
+              <w:t>ubicacion</w:t>
+            </w:r>
+            <w:proofErr w:type="spellEnd"/>
+            <w:r>
+              <w:rPr>
+                <w:rFonts w:ascii="Tahoma" w:eastAsia="Consolas" w:hAnsi="Tahoma" w:cs="Tahoma"/>
+                <w:lang w:val="en-GB"/>
+              </w:rPr>
+              <w:t>}}</w:t>
             </w:r>
           </w:p>
           <w:p>
@@ -330,6 +431,7 @@
                 <w:rFonts w:ascii="Tahoma" w:hAnsi="Tahoma" w:cs="Tahoma"/>
               </w:rPr>
             </w:pPr>
+            <w:proofErr w:type="gramStart"/>
             <w:r>
               <w:rPr>
                 <w:rFonts w:ascii="Tahoma" w:hAnsi="Tahoma" w:cs="Tahoma"/>
@@ -340,7 +442,14 @@
               <w:rPr>
                 <w:rFonts w:ascii="Tahoma" w:eastAsia="Consolas" w:hAnsi="Tahoma" w:cs="Tahoma"/>
               </w:rPr>
-              <w:t>{{eta}}</w:t>
+              <w:t>{</w:t>
+            </w:r>
+            <w:proofErr w:type="gramEnd"/>
+            <w:r>
+              <w:rPr>
+                <w:rFonts w:ascii="Tahoma" w:eastAsia="Consolas" w:hAnsi="Tahoma" w:cs="Tahoma"/>
+              </w:rPr>
+              <w:t>{eta}}</w:t>
             </w:r>
           </w:p>
         </w:tc>
@@ -359,7 +468,21 @@
           <w:rFonts w:ascii="Tahoma" w:hAnsi="Tahoma" w:cs="Tahoma"/>
           <w:lang w:val="en-GB"/>
         </w:rPr>
-        <w:t>We are pleased to submit our quotation for the products detailed below:</w:t>
+        <w:t xml:space="preserve">We are pleased to submit our quotation for the </w:t>
+      </w:r>
+      <w:r>
+        <w:rPr>
+          <w:rFonts w:ascii="Tahoma" w:hAnsi="Tahoma" w:cs="Tahoma"/>
+          <w:lang w:val="en-GB"/>
+        </w:rPr>
+        <w:t>products</w:t>
+      </w:r>
+      <w:r>
+        <w:rPr>
+          <w:rFonts w:ascii="Tahoma" w:hAnsi="Tahoma" w:cs="Tahoma"/>
+          <w:lang w:val="en-GB"/>
+        </w:rPr>
+        <w:t xml:space="preserve"> detailed below:</w:t>
       </w:r>
     </w:p>
     <w:p>
@@ -367,6 +490,7 @@
         <w:spacing w:before="240" w:after="90"/>
         <w:rPr>
           <w:rFonts w:ascii="Tahoma" w:hAnsi="Tahoma" w:cs="Tahoma"/>
+          <w:lang w:val="en-GB"/>
         </w:rPr>
       </w:pPr>
     </w:p>
@@ -415,7 +539,17 @@
                 <w:sz w:val="17"/>
                 <w:szCs w:val="17"/>
               </w:rPr>
-              <w:t>DESCRIPTION</w:t>
+              <w:t>D</w:t>
+            </w:r>
+            <w:r>
+              <w:rPr>
+                <w:rFonts w:ascii="Tahoma" w:hAnsi="Tahoma" w:cs="Tahoma"/>
+                <w:b/>
+                <w:bCs/>
+                <w:sz w:val="17"/>
+                <w:szCs w:val="17"/>
+              </w:rPr>
+              <w:t>ESCRIPTION</w:t>
             </w:r>
           </w:p>
         </w:tc>
@@ -439,6 +573,7 @@
                 <w:rFonts w:ascii="Tahoma" w:hAnsi="Tahoma" w:cs="Tahoma"/>
               </w:rPr>
             </w:pPr>
+            <w:proofErr w:type="spellStart"/>
             <w:r>
               <w:rPr>
                 <w:rFonts w:ascii="Tahoma" w:hAnsi="Tahoma" w:cs="Tahoma"/>
@@ -447,7 +582,18 @@
                 <w:sz w:val="17"/>
                 <w:szCs w:val="17"/>
               </w:rPr>
-              <w:t>Qty.</w:t>
+              <w:t>Qty</w:t>
+            </w:r>
+            <w:proofErr w:type="spellEnd"/>
+            <w:r>
+              <w:rPr>
+                <w:rFonts w:ascii="Tahoma" w:hAnsi="Tahoma" w:cs="Tahoma"/>
+                <w:b/>
+                <w:bCs/>
+                <w:sz w:val="17"/>
+                <w:szCs w:val="17"/>
+              </w:rPr>
+              <w:t>.</w:t>
             </w:r>
           </w:p>
         </w:tc>
@@ -471,6 +617,7 @@
                 <w:rFonts w:ascii="Tahoma" w:hAnsi="Tahoma" w:cs="Tahoma"/>
               </w:rPr>
             </w:pPr>
+            <w:proofErr w:type="spellStart"/>
             <w:r>
               <w:rPr>
                 <w:rFonts w:ascii="Tahoma" w:hAnsi="Tahoma" w:cs="Tahoma"/>
@@ -481,6 +628,7 @@
               </w:rPr>
               <w:t>Unit</w:t>
             </w:r>
+            <w:proofErr w:type="spellEnd"/>
           </w:p>
         </w:tc>
         <w:tc>
@@ -503,6 +651,7 @@
                 <w:rFonts w:ascii="Tahoma" w:hAnsi="Tahoma" w:cs="Tahoma"/>
               </w:rPr>
             </w:pPr>
+            <w:proofErr w:type="spellStart"/>
             <w:r>
               <w:rPr>
                 <w:rFonts w:ascii="Tahoma" w:hAnsi="Tahoma" w:cs="Tahoma"/>
@@ -511,7 +660,18 @@
                 <w:sz w:val="17"/>
                 <w:szCs w:val="17"/>
               </w:rPr>
-              <w:t>Unit Price</w:t>
+              <w:t>Unit</w:t>
+            </w:r>
+            <w:proofErr w:type="spellEnd"/>
+            <w:r>
+              <w:rPr>
+                <w:rFonts w:ascii="Tahoma" w:hAnsi="Tahoma" w:cs="Tahoma"/>
+                <w:b/>
+                <w:bCs/>
+                <w:sz w:val="17"/>
+                <w:szCs w:val="17"/>
+              </w:rPr>
+              <w:t xml:space="preserve"> Price</w:t>
             </w:r>
           </w:p>
         </w:tc>
@@ -535,6 +695,7 @@
                 <w:rFonts w:ascii="Tahoma" w:hAnsi="Tahoma" w:cs="Tahoma"/>
               </w:rPr>
             </w:pPr>
+            <w:proofErr w:type="spellStart"/>
             <w:r>
               <w:rPr>
                 <w:rFonts w:ascii="Tahoma" w:hAnsi="Tahoma" w:cs="Tahoma"/>
@@ -545,6 +706,7 @@
               </w:rPr>
               <w:t>Amount</w:t>
             </w:r>
+            <w:proofErr w:type="spellEnd"/>
           </w:p>
         </w:tc>
       </w:tr>
@@ -681,7 +843,25 @@
                 <w:rFonts w:ascii="Tahoma" w:hAnsi="Tahoma" w:cs="Tahoma"/>
                 <w:lang w:val="en-GB"/>
               </w:rPr>
-              <w:t>{{item.descripcion}}</w:t>
+              <w:t>{{</w:t>
+            </w:r>
+            <w:proofErr w:type="spellStart"/>
+            <w:proofErr w:type="gramStart"/>
+            <w:r>
+              <w:rPr>
+                <w:rFonts w:ascii="Tahoma" w:hAnsi="Tahoma" w:cs="Tahoma"/>
+                <w:lang w:val="en-GB"/>
+              </w:rPr>
+              <w:t>item.descripcion</w:t>
+            </w:r>
+            <w:proofErr w:type="spellEnd"/>
+            <w:proofErr w:type="gramEnd"/>
+            <w:r>
+              <w:rPr>
+                <w:rFonts w:ascii="Tahoma" w:hAnsi="Tahoma" w:cs="Tahoma"/>
+                <w:lang w:val="en-GB"/>
+              </w:rPr>
+              <w:t>}}</w:t>
             </w:r>
           </w:p>
         </w:tc>
@@ -706,7 +886,23 @@
               <w:rPr>
                 <w:rFonts w:ascii="Tahoma" w:hAnsi="Tahoma" w:cs="Tahoma"/>
               </w:rPr>
-              <w:t>{{item.cantidad}}</w:t>
+              <w:t>{{</w:t>
+            </w:r>
+            <w:proofErr w:type="spellStart"/>
+            <w:proofErr w:type="gramStart"/>
+            <w:r>
+              <w:rPr>
+                <w:rFonts w:ascii="Tahoma" w:hAnsi="Tahoma" w:cs="Tahoma"/>
+              </w:rPr>
+              <w:t>item.cantidad</w:t>
+            </w:r>
+            <w:proofErr w:type="spellEnd"/>
+            <w:proofErr w:type="gramEnd"/>
+            <w:r>
+              <w:rPr>
+                <w:rFonts w:ascii="Tahoma" w:hAnsi="Tahoma" w:cs="Tahoma"/>
+              </w:rPr>
+              <w:t>}}</w:t>
             </w:r>
           </w:p>
         </w:tc>
@@ -731,7 +927,23 @@
               <w:rPr>
                 <w:rFonts w:ascii="Tahoma" w:hAnsi="Tahoma" w:cs="Tahoma"/>
               </w:rPr>
-              <w:t>{{item.unidad}}</w:t>
+              <w:t>{{</w:t>
+            </w:r>
+            <w:proofErr w:type="spellStart"/>
+            <w:proofErr w:type="gramStart"/>
+            <w:r>
+              <w:rPr>
+                <w:rFonts w:ascii="Tahoma" w:hAnsi="Tahoma" w:cs="Tahoma"/>
+              </w:rPr>
+              <w:t>item.unidad</w:t>
+            </w:r>
+            <w:proofErr w:type="spellEnd"/>
+            <w:proofErr w:type="gramEnd"/>
+            <w:r>
+              <w:rPr>
+                <w:rFonts w:ascii="Tahoma" w:hAnsi="Tahoma" w:cs="Tahoma"/>
+              </w:rPr>
+              <w:t>}}</w:t>
             </w:r>
           </w:p>
         </w:tc>
@@ -756,7 +968,23 @@
               <w:rPr>
                 <w:rFonts w:ascii="Tahoma" w:hAnsi="Tahoma" w:cs="Tahoma"/>
               </w:rPr>
-              <w:t>{{item.precio}}</w:t>
+              <w:t>{{</w:t>
+            </w:r>
+            <w:proofErr w:type="spellStart"/>
+            <w:proofErr w:type="gramStart"/>
+            <w:r>
+              <w:rPr>
+                <w:rFonts w:ascii="Tahoma" w:hAnsi="Tahoma" w:cs="Tahoma"/>
+              </w:rPr>
+              <w:t>item.precio</w:t>
+            </w:r>
+            <w:proofErr w:type="spellEnd"/>
+            <w:proofErr w:type="gramEnd"/>
+            <w:r>
+              <w:rPr>
+                <w:rFonts w:ascii="Tahoma" w:hAnsi="Tahoma" w:cs="Tahoma"/>
+              </w:rPr>
+              <w:t>}}</w:t>
             </w:r>
           </w:p>
         </w:tc>
@@ -782,7 +1010,23 @@
               <w:rPr>
                 <w:rFonts w:ascii="Tahoma" w:hAnsi="Tahoma" w:cs="Tahoma"/>
               </w:rPr>
-              <w:t>{{item.importe}}</w:t>
+              <w:t>{{</w:t>
+            </w:r>
+            <w:proofErr w:type="spellStart"/>
+            <w:proofErr w:type="gramStart"/>
+            <w:r>
+              <w:rPr>
+                <w:rFonts w:ascii="Tahoma" w:hAnsi="Tahoma" w:cs="Tahoma"/>
+              </w:rPr>
+              <w:t>item.importe</w:t>
+            </w:r>
+            <w:proofErr w:type="spellEnd"/>
+            <w:proofErr w:type="gramEnd"/>
+            <w:r>
+              <w:rPr>
+                <w:rFonts w:ascii="Tahoma" w:hAnsi="Tahoma" w:cs="Tahoma"/>
+              </w:rPr>
+              <w:t>}}</w:t>
             </w:r>
           </w:p>
         </w:tc>
@@ -903,7 +1147,43 @@
                 <w:i/>
                 <w:iCs/>
               </w:rPr>
-              <w:t>{%tr endfor %}</w:t>
+              <w:t>{%</w:t>
+            </w:r>
+            <w:proofErr w:type="spellStart"/>
+            <w:r>
+              <w:rPr>
+                <w:rFonts w:ascii="Tahoma" w:hAnsi="Tahoma" w:cs="Tahoma"/>
+                <w:i/>
+                <w:iCs/>
+              </w:rPr>
+              <w:t>tr</w:t>
+            </w:r>
+            <w:proofErr w:type="spellEnd"/>
+            <w:r>
+              <w:rPr>
+                <w:rFonts w:ascii="Tahoma" w:hAnsi="Tahoma" w:cs="Tahoma"/>
+                <w:i/>
+                <w:iCs/>
+              </w:rPr>
+              <w:t xml:space="preserve"> </w:t>
+            </w:r>
+            <w:proofErr w:type="spellStart"/>
+            <w:r>
+              <w:rPr>
+                <w:rFonts w:ascii="Tahoma" w:hAnsi="Tahoma" w:cs="Tahoma"/>
+                <w:i/>
+                <w:iCs/>
+              </w:rPr>
+              <w:t>endfor</w:t>
+            </w:r>
+            <w:proofErr w:type="spellEnd"/>
+            <w:r>
+              <w:rPr>
+                <w:rFonts w:ascii="Tahoma" w:hAnsi="Tahoma" w:cs="Tahoma"/>
+                <w:i/>
+                <w:iCs/>
+              </w:rPr>
+              <w:t xml:space="preserve"> %}</w:t>
             </w:r>
           </w:p>
           <w:p>
@@ -940,7 +1220,15 @@
     </w:p>
     <w:p>
       <w:r>
-        <w:t>{%p if expensas %}</w:t>
+        <w:t xml:space="preserve">{%p </w:t>
+      </w:r>
+      <w:proofErr w:type="spellStart"/>
+      <w:r>
+        <w:t>if</w:t>
+      </w:r>
+      <w:proofErr w:type="spellEnd"/>
+      <w:r>
+        <w:t xml:space="preserve"> expensas %}</w:t>
       </w:r>
     </w:p>
     <w:tbl>
@@ -1132,7 +1420,45 @@
                 <w:iCs/>
                 <w:lang w:val="en-GB"/>
               </w:rPr>
-              <w:t xml:space="preserve">{%tr for exp in expensas %} </w:t>
+              <w:t xml:space="preserve">{%tr for </w:t>
+            </w:r>
+            <w:r>
+              <w:rPr>
+                <w:rFonts w:ascii="Tahoma" w:hAnsi="Tahoma" w:cs="Tahoma"/>
+                <w:i/>
+                <w:iCs/>
+                <w:lang w:val="en-GB"/>
+              </w:rPr>
+              <w:t>exp</w:t>
+            </w:r>
+            <w:r>
+              <w:rPr>
+                <w:rFonts w:ascii="Tahoma" w:hAnsi="Tahoma" w:cs="Tahoma"/>
+                <w:i/>
+                <w:iCs/>
+                <w:lang w:val="en-GB"/>
+              </w:rPr>
+              <w:t xml:space="preserve"> in </w:t>
+            </w:r>
+            <w:proofErr w:type="spellStart"/>
+            <w:r>
+              <w:rPr>
+                <w:rFonts w:ascii="Tahoma" w:hAnsi="Tahoma" w:cs="Tahoma"/>
+                <w:i/>
+                <w:iCs/>
+                <w:lang w:val="en-GB"/>
+              </w:rPr>
+              <w:t>expensas</w:t>
+            </w:r>
+            <w:proofErr w:type="spellEnd"/>
+            <w:r>
+              <w:rPr>
+                <w:rFonts w:ascii="Tahoma" w:hAnsi="Tahoma" w:cs="Tahoma"/>
+                <w:i/>
+                <w:iCs/>
+                <w:lang w:val="en-GB"/>
+              </w:rPr>
+              <w:t xml:space="preserve"> %} </w:t>
             </w:r>
           </w:p>
         </w:tc>
@@ -1240,7 +1566,32 @@
                 <w:rFonts w:ascii="Tahoma" w:hAnsi="Tahoma" w:cs="Tahoma"/>
                 <w:lang w:val="en-GB"/>
               </w:rPr>
-              <w:t>{{exp.descripcion}}</w:t>
+              <w:t>{{</w:t>
+            </w:r>
+            <w:proofErr w:type="spellStart"/>
+            <w:proofErr w:type="gramStart"/>
+            <w:r>
+              <w:rPr>
+                <w:rFonts w:ascii="Tahoma" w:hAnsi="Tahoma" w:cs="Tahoma"/>
+                <w:lang w:val="en-GB"/>
+              </w:rPr>
+              <w:t>exp</w:t>
+            </w:r>
+            <w:r>
+              <w:rPr>
+                <w:rFonts w:ascii="Tahoma" w:hAnsi="Tahoma" w:cs="Tahoma"/>
+                <w:lang w:val="en-GB"/>
+              </w:rPr>
+              <w:t>.descripcion</w:t>
+            </w:r>
+            <w:proofErr w:type="spellEnd"/>
+            <w:proofErr w:type="gramEnd"/>
+            <w:r>
+              <w:rPr>
+                <w:rFonts w:ascii="Tahoma" w:hAnsi="Tahoma" w:cs="Tahoma"/>
+                <w:lang w:val="en-GB"/>
+              </w:rPr>
+              <w:t>}}</w:t>
             </w:r>
           </w:p>
         </w:tc>
@@ -1266,7 +1617,35 @@
               <w:rPr>
                 <w:rFonts w:ascii="Tahoma" w:hAnsi="Tahoma" w:cs="Tahoma"/>
               </w:rPr>
-              <w:t>{{exp.cantidad}}</w:t>
+              <w:t>{{</w:t>
+            </w:r>
+            <w:proofErr w:type="spellStart"/>
+            <w:proofErr w:type="gramStart"/>
+            <w:r>
+              <w:rPr>
+                <w:rFonts w:ascii="Tahoma" w:hAnsi="Tahoma" w:cs="Tahoma"/>
+              </w:rPr>
+              <w:t>exp</w:t>
+            </w:r>
+            <w:r>
+              <w:rPr>
+                <w:rFonts w:ascii="Tahoma" w:hAnsi="Tahoma" w:cs="Tahoma"/>
+              </w:rPr>
+              <w:t>.</w:t>
+            </w:r>
+            <w:r>
+              <w:rPr>
+                <w:rFonts w:ascii="Tahoma" w:hAnsi="Tahoma" w:cs="Tahoma"/>
+              </w:rPr>
+              <w:t>cantidad</w:t>
+            </w:r>
+            <w:proofErr w:type="spellEnd"/>
+            <w:proofErr w:type="gramEnd"/>
+            <w:r>
+              <w:rPr>
+                <w:rFonts w:ascii="Tahoma" w:hAnsi="Tahoma" w:cs="Tahoma"/>
+              </w:rPr>
+              <w:t>}}</w:t>
             </w:r>
           </w:p>
         </w:tc>
@@ -1291,7 +1670,29 @@
               <w:rPr>
                 <w:rFonts w:ascii="Tahoma" w:hAnsi="Tahoma" w:cs="Tahoma"/>
               </w:rPr>
-              <w:t>{{exp.unidad}}</w:t>
+              <w:t>{{</w:t>
+            </w:r>
+            <w:proofErr w:type="spellStart"/>
+            <w:proofErr w:type="gramStart"/>
+            <w:r>
+              <w:rPr>
+                <w:rFonts w:ascii="Tahoma" w:hAnsi="Tahoma" w:cs="Tahoma"/>
+              </w:rPr>
+              <w:t>exp</w:t>
+            </w:r>
+            <w:r>
+              <w:rPr>
+                <w:rFonts w:ascii="Tahoma" w:hAnsi="Tahoma" w:cs="Tahoma"/>
+              </w:rPr>
+              <w:t>.unidad</w:t>
+            </w:r>
+            <w:proofErr w:type="spellEnd"/>
+            <w:proofErr w:type="gramEnd"/>
+            <w:r>
+              <w:rPr>
+                <w:rFonts w:ascii="Tahoma" w:hAnsi="Tahoma" w:cs="Tahoma"/>
+              </w:rPr>
+              <w:t>}}</w:t>
             </w:r>
           </w:p>
         </w:tc>
@@ -1316,7 +1717,29 @@
               <w:rPr>
                 <w:rFonts w:ascii="Tahoma" w:hAnsi="Tahoma" w:cs="Tahoma"/>
               </w:rPr>
-              <w:t>{{exp.precio}}</w:t>
+              <w:t>{{</w:t>
+            </w:r>
+            <w:proofErr w:type="spellStart"/>
+            <w:proofErr w:type="gramStart"/>
+            <w:r>
+              <w:rPr>
+                <w:rFonts w:ascii="Tahoma" w:hAnsi="Tahoma" w:cs="Tahoma"/>
+              </w:rPr>
+              <w:t>exp</w:t>
+            </w:r>
+            <w:r>
+              <w:rPr>
+                <w:rFonts w:ascii="Tahoma" w:hAnsi="Tahoma" w:cs="Tahoma"/>
+              </w:rPr>
+              <w:t>.precio</w:t>
+            </w:r>
+            <w:proofErr w:type="spellEnd"/>
+            <w:proofErr w:type="gramEnd"/>
+            <w:r>
+              <w:rPr>
+                <w:rFonts w:ascii="Tahoma" w:hAnsi="Tahoma" w:cs="Tahoma"/>
+              </w:rPr>
+              <w:t>}}</w:t>
             </w:r>
           </w:p>
         </w:tc>
@@ -1342,7 +1765,29 @@
               <w:rPr>
                 <w:rFonts w:ascii="Tahoma" w:hAnsi="Tahoma" w:cs="Tahoma"/>
               </w:rPr>
-              <w:t>{{exp.importe}}</w:t>
+              <w:t>{{</w:t>
+            </w:r>
+            <w:proofErr w:type="spellStart"/>
+            <w:proofErr w:type="gramStart"/>
+            <w:r>
+              <w:rPr>
+                <w:rFonts w:ascii="Tahoma" w:hAnsi="Tahoma" w:cs="Tahoma"/>
+              </w:rPr>
+              <w:t>exp</w:t>
+            </w:r>
+            <w:r>
+              <w:rPr>
+                <w:rFonts w:ascii="Tahoma" w:hAnsi="Tahoma" w:cs="Tahoma"/>
+              </w:rPr>
+              <w:t>.importe</w:t>
+            </w:r>
+            <w:proofErr w:type="spellEnd"/>
+            <w:proofErr w:type="gramEnd"/>
+            <w:r>
+              <w:rPr>
+                <w:rFonts w:ascii="Tahoma" w:hAnsi="Tahoma" w:cs="Tahoma"/>
+              </w:rPr>
+              <w:t>}}</w:t>
             </w:r>
           </w:p>
         </w:tc>
@@ -1463,7 +1908,43 @@
                 <w:i/>
                 <w:iCs/>
               </w:rPr>
-              <w:t>{%tr endfor %}</w:t>
+              <w:t>{%</w:t>
+            </w:r>
+            <w:proofErr w:type="spellStart"/>
+            <w:r>
+              <w:rPr>
+                <w:rFonts w:ascii="Tahoma" w:hAnsi="Tahoma" w:cs="Tahoma"/>
+                <w:i/>
+                <w:iCs/>
+              </w:rPr>
+              <w:t>tr</w:t>
+            </w:r>
+            <w:proofErr w:type="spellEnd"/>
+            <w:r>
+              <w:rPr>
+                <w:rFonts w:ascii="Tahoma" w:hAnsi="Tahoma" w:cs="Tahoma"/>
+                <w:i/>
+                <w:iCs/>
+              </w:rPr>
+              <w:t xml:space="preserve"> </w:t>
+            </w:r>
+            <w:proofErr w:type="spellStart"/>
+            <w:r>
+              <w:rPr>
+                <w:rFonts w:ascii="Tahoma" w:hAnsi="Tahoma" w:cs="Tahoma"/>
+                <w:i/>
+                <w:iCs/>
+              </w:rPr>
+              <w:t>endfor</w:t>
+            </w:r>
+            <w:proofErr w:type="spellEnd"/>
+            <w:r>
+              <w:rPr>
+                <w:rFonts w:ascii="Tahoma" w:hAnsi="Tahoma" w:cs="Tahoma"/>
+                <w:i/>
+                <w:iCs/>
+              </w:rPr>
+              <w:t xml:space="preserve"> %}</w:t>
             </w:r>
           </w:p>
           <w:p>
@@ -1492,8 +1973,44 @@
         <w:spacing w:before="240" w:after="90"/>
       </w:pPr>
       <w:r>
-        <w:t>{%p endif %}</w:t>
+        <w:t xml:space="preserve">{%p </w:t>
       </w:r>
+      <w:proofErr w:type="spellStart"/>
+      <w:r>
+        <w:t>endif</w:t>
+      </w:r>
+      <w:proofErr w:type="spellEnd"/>
+      <w:r>
+        <w:t xml:space="preserve"> %}</w:t>
+      </w:r>
+    </w:p>
+    <w:p>
+      <w:pPr>
+        <w:keepNext/>
+        <w:keepLines/>
+        <w:spacing w:before="240" w:after="90"/>
+        <w:rPr>
+          <w:rFonts w:ascii="Tahoma" w:hAnsi="Tahoma" w:cs="Tahoma"/>
+          <w:b/>
+          <w:bCs/>
+          <w:sz w:val="16"/>
+          <w:szCs w:val="16"/>
+        </w:rPr>
+      </w:pPr>
+    </w:p>
+    <w:p>
+      <w:pPr>
+        <w:keepNext/>
+        <w:keepLines/>
+        <w:spacing w:before="240" w:after="90"/>
+        <w:rPr>
+          <w:rFonts w:ascii="Tahoma" w:hAnsi="Tahoma" w:cs="Tahoma"/>
+          <w:b/>
+          <w:bCs/>
+          <w:sz w:val="16"/>
+          <w:szCs w:val="16"/>
+        </w:rPr>
+      </w:pPr>
     </w:p>
     <w:tbl>
       <w:tblPr>
@@ -1535,7 +2052,6 @@
               <w:rPr>
                 <w:rFonts w:ascii="Tahoma" w:hAnsi="Tahoma" w:cs="Tahoma"/>
               </w:rPr>
-              <w:lastRenderedPageBreak/>
               <w:t>VAT</w:t>
             </w:r>
           </w:p>
@@ -1562,7 +2078,21 @@
               <w:rPr>
                 <w:rFonts w:ascii="Tahoma" w:hAnsi="Tahoma" w:cs="Tahoma"/>
               </w:rPr>
-              <w:t>{{iva}}</w:t>
+              <w:t>{{</w:t>
+            </w:r>
+            <w:proofErr w:type="spellStart"/>
+            <w:r>
+              <w:rPr>
+                <w:rFonts w:ascii="Tahoma" w:hAnsi="Tahoma" w:cs="Tahoma"/>
+              </w:rPr>
+              <w:t>iva</w:t>
+            </w:r>
+            <w:proofErr w:type="spellEnd"/>
+            <w:r>
+              <w:rPr>
+                <w:rFonts w:ascii="Tahoma" w:hAnsi="Tahoma" w:cs="Tahoma"/>
+              </w:rPr>
+              <w:t>}}</w:t>
             </w:r>
           </w:p>
         </w:tc>
@@ -1592,14 +2122,44 @@
               <w:rPr>
                 <w:rFonts w:ascii="Tahoma" w:hAnsi="Tahoma" w:cs="Tahoma"/>
               </w:rPr>
-              <w:t xml:space="preserve">{%tr if </w:t>
-            </w:r>
+              <w:t>{%</w:t>
+            </w:r>
+            <w:proofErr w:type="spellStart"/>
+            <w:r>
+              <w:rPr>
+                <w:rFonts w:ascii="Tahoma" w:hAnsi="Tahoma" w:cs="Tahoma"/>
+              </w:rPr>
+              <w:t>tr</w:t>
+            </w:r>
+            <w:proofErr w:type="spellEnd"/>
+            <w:r>
+              <w:rPr>
+                <w:rFonts w:ascii="Tahoma" w:hAnsi="Tahoma" w:cs="Tahoma"/>
+              </w:rPr>
+              <w:t xml:space="preserve"> </w:t>
+            </w:r>
+            <w:proofErr w:type="spellStart"/>
+            <w:r>
+              <w:rPr>
+                <w:rFonts w:ascii="Tahoma" w:hAnsi="Tahoma" w:cs="Tahoma"/>
+              </w:rPr>
+              <w:t>if</w:t>
+            </w:r>
+            <w:proofErr w:type="spellEnd"/>
+            <w:r>
+              <w:rPr>
+                <w:rFonts w:ascii="Tahoma" w:hAnsi="Tahoma" w:cs="Tahoma"/>
+              </w:rPr>
+              <w:t xml:space="preserve"> </w:t>
+            </w:r>
+            <w:proofErr w:type="spellStart"/>
             <w:r>
               <w:rPr>
                 <w:rFonts w:ascii="Tahoma" w:hAnsi="Tahoma" w:cs="Tahoma"/>
               </w:rPr>
               <w:t>has_discount</w:t>
             </w:r>
+            <w:proofErr w:type="spellEnd"/>
             <w:r>
               <w:rPr>
                 <w:rFonts w:ascii="Tahoma" w:hAnsi="Tahoma" w:cs="Tahoma"/>
@@ -1654,12 +2214,14 @@
                 <w:szCs w:val="19"/>
               </w:rPr>
             </w:pPr>
+            <w:proofErr w:type="spellStart"/>
             <w:r>
               <w:rPr>
                 <w:rFonts w:ascii="Tahoma" w:hAnsi="Tahoma" w:cs="Tahoma"/>
               </w:rPr>
               <w:t>Discount</w:t>
             </w:r>
+            <w:proofErr w:type="spellEnd"/>
           </w:p>
         </w:tc>
         <w:tc>
@@ -1734,7 +2296,43 @@
                 <w:sz w:val="22"/>
                 <w:szCs w:val="22"/>
               </w:rPr>
-              <w:t>{%tr endif%}</w:t>
+              <w:t>{%</w:t>
+            </w:r>
+            <w:proofErr w:type="spellStart"/>
+            <w:r>
+              <w:rPr>
+                <w:rFonts w:ascii="Tahoma" w:hAnsi="Tahoma" w:cs="Tahoma"/>
+                <w:sz w:val="22"/>
+                <w:szCs w:val="22"/>
+              </w:rPr>
+              <w:t>tr</w:t>
+            </w:r>
+            <w:proofErr w:type="spellEnd"/>
+            <w:r>
+              <w:rPr>
+                <w:rFonts w:ascii="Tahoma" w:hAnsi="Tahoma" w:cs="Tahoma"/>
+                <w:sz w:val="22"/>
+                <w:szCs w:val="22"/>
+              </w:rPr>
+              <w:t xml:space="preserve"> </w:t>
+            </w:r>
+            <w:proofErr w:type="spellStart"/>
+            <w:r>
+              <w:rPr>
+                <w:rFonts w:ascii="Tahoma" w:hAnsi="Tahoma" w:cs="Tahoma"/>
+                <w:sz w:val="22"/>
+                <w:szCs w:val="22"/>
+              </w:rPr>
+              <w:t>endif</w:t>
+            </w:r>
+            <w:proofErr w:type="spellEnd"/>
+            <w:r>
+              <w:rPr>
+                <w:rFonts w:ascii="Tahoma" w:hAnsi="Tahoma" w:cs="Tahoma"/>
+                <w:sz w:val="22"/>
+                <w:szCs w:val="22"/>
+              </w:rPr>
+              <w:t>%}</w:t>
             </w:r>
           </w:p>
         </w:tc>
@@ -1906,6 +2504,36 @@
     </w:tbl>
     <w:p>
       <w:pPr>
+        <w:keepNext/>
+        <w:keepLines/>
+        <w:spacing w:before="240" w:after="90"/>
+        <w:rPr>
+          <w:rFonts w:ascii="Tahoma" w:hAnsi="Tahoma" w:cs="Tahoma"/>
+          <w:b/>
+          <w:bCs/>
+          <w:sz w:val="16"/>
+          <w:szCs w:val="16"/>
+        </w:rPr>
+      </w:pPr>
+    </w:p>
+    <w:p>
+      <w:pPr>
+        <w:keepNext/>
+        <w:keepLines/>
+        <w:spacing w:before="240" w:after="90"/>
+        <w:rPr>
+          <w:rFonts w:ascii="Tahoma" w:hAnsi="Tahoma" w:cs="Tahoma"/>
+          <w:b/>
+          <w:bCs/>
+          <w:sz w:val="16"/>
+          <w:szCs w:val="16"/>
+        </w:rPr>
+      </w:pPr>
+    </w:p>
+    <w:p>
+      <w:pPr>
+        <w:keepNext/>
+        <w:keepLines/>
         <w:spacing w:before="240" w:after="90"/>
         <w:rPr>
           <w:rFonts w:ascii="Tahoma" w:hAnsi="Tahoma" w:cs="Tahoma"/>
@@ -1918,54 +2546,6 @@
     </w:p>
     <w:p>
       <w:pPr>
-        <w:keepNext/>
-        <w:keepLines/>
-        <w:widowControl w:val="0"/>
-        <w:spacing w:before="240" w:after="90"/>
-        <w:rPr>
-          <w:rFonts w:ascii="Tahoma" w:hAnsi="Tahoma" w:cs="Tahoma"/>
-          <w:b/>
-          <w:bCs/>
-          <w:sz w:val="19"/>
-          <w:szCs w:val="19"/>
-        </w:rPr>
-      </w:pPr>
-    </w:p>
-    <w:p>
-      <w:pPr>
-        <w:keepNext/>
-        <w:keepLines/>
-        <w:widowControl w:val="0"/>
-        <w:spacing w:before="240" w:after="90"/>
-        <w:rPr>
-          <w:rFonts w:ascii="Tahoma" w:hAnsi="Tahoma" w:cs="Tahoma"/>
-          <w:b/>
-          <w:bCs/>
-          <w:sz w:val="19"/>
-          <w:szCs w:val="19"/>
-        </w:rPr>
-      </w:pPr>
-    </w:p>
-    <w:p>
-      <w:pPr>
-        <w:keepNext/>
-        <w:keepLines/>
-        <w:widowControl w:val="0"/>
-        <w:spacing w:before="240" w:after="90"/>
-        <w:rPr>
-          <w:rFonts w:ascii="Tahoma" w:hAnsi="Tahoma" w:cs="Tahoma"/>
-          <w:b/>
-          <w:bCs/>
-          <w:sz w:val="19"/>
-          <w:szCs w:val="19"/>
-        </w:rPr>
-      </w:pPr>
-    </w:p>
-    <w:p>
-      <w:pPr>
-        <w:keepNext/>
-        <w:keepLines/>
-        <w:widowControl w:val="0"/>
         <w:spacing w:before="240" w:after="90"/>
         <w:rPr>
           <w:rFonts w:ascii="Tahoma" w:hAnsi="Tahoma" w:cs="Tahoma"/>
@@ -2094,8 +2674,20 @@
                 <w:sz w:val="19"/>
                 <w:szCs w:val="19"/>
               </w:rPr>
-              <w:t>Offer validity</w:t>
-            </w:r>
+              <w:t xml:space="preserve">Offer </w:t>
+            </w:r>
+            <w:proofErr w:type="spellStart"/>
+            <w:r>
+              <w:rPr>
+                <w:rFonts w:ascii="Tahoma" w:hAnsi="Tahoma" w:cs="Tahoma"/>
+                <w:b/>
+                <w:bCs/>
+                <w:sz w:val="19"/>
+                <w:szCs w:val="19"/>
+              </w:rPr>
+              <w:t>validity</w:t>
+            </w:r>
+            <w:proofErr w:type="spellEnd"/>
           </w:p>
         </w:tc>
         <w:tc>
@@ -2154,8 +2746,20 @@
                 <w:sz w:val="19"/>
                 <w:szCs w:val="19"/>
               </w:rPr>
-              <w:t>Payment terms</w:t>
-            </w:r>
+              <w:t xml:space="preserve">Payment </w:t>
+            </w:r>
+            <w:proofErr w:type="spellStart"/>
+            <w:r>
+              <w:rPr>
+                <w:rFonts w:ascii="Tahoma" w:hAnsi="Tahoma" w:cs="Tahoma"/>
+                <w:b/>
+                <w:bCs/>
+                <w:sz w:val="19"/>
+                <w:szCs w:val="19"/>
+              </w:rPr>
+              <w:t>terms</w:t>
+            </w:r>
+            <w:proofErr w:type="spellEnd"/>
           </w:p>
         </w:tc>
         <w:tc>
@@ -2181,7 +2785,21 @@
               <w:rPr>
                 <w:rFonts w:ascii="Tahoma" w:hAnsi="Tahoma" w:cs="Tahoma"/>
               </w:rPr>
-              <w:t>{{forma_de_pago}}</w:t>
+              <w:t>{{</w:t>
+            </w:r>
+            <w:proofErr w:type="spellStart"/>
+            <w:r>
+              <w:rPr>
+                <w:rFonts w:ascii="Tahoma" w:hAnsi="Tahoma" w:cs="Tahoma"/>
+              </w:rPr>
+              <w:t>forma_de_pago</w:t>
+            </w:r>
+            <w:proofErr w:type="spellEnd"/>
+            <w:r>
+              <w:rPr>
+                <w:rFonts w:ascii="Tahoma" w:hAnsi="Tahoma" w:cs="Tahoma"/>
+              </w:rPr>
+              <w:t>}}</w:t>
             </w:r>
           </w:p>
         </w:tc>
@@ -2241,7 +2859,35 @@
               <w:rPr>
                 <w:rFonts w:ascii="Tahoma" w:hAnsi="Tahoma" w:cs="Tahoma"/>
               </w:rPr>
-              <w:t>{{tiempo_entrega}} days.</w:t>
+              <w:t>{{</w:t>
+            </w:r>
+            <w:proofErr w:type="spellStart"/>
+            <w:r>
+              <w:rPr>
+                <w:rFonts w:ascii="Tahoma" w:hAnsi="Tahoma" w:cs="Tahoma"/>
+              </w:rPr>
+              <w:t>tiempo_entrega</w:t>
+            </w:r>
+            <w:proofErr w:type="spellEnd"/>
+            <w:r>
+              <w:rPr>
+                <w:rFonts w:ascii="Tahoma" w:hAnsi="Tahoma" w:cs="Tahoma"/>
+              </w:rPr>
+              <w:t xml:space="preserve">}} </w:t>
+            </w:r>
+            <w:proofErr w:type="spellStart"/>
+            <w:r>
+              <w:rPr>
+                <w:rFonts w:ascii="Tahoma" w:hAnsi="Tahoma" w:cs="Tahoma"/>
+              </w:rPr>
+              <w:t>days</w:t>
+            </w:r>
+            <w:proofErr w:type="spellEnd"/>
+            <w:r>
+              <w:rPr>
+                <w:rFonts w:ascii="Tahoma" w:hAnsi="Tahoma" w:cs="Tahoma"/>
+              </w:rPr>
+              <w:t>.</w:t>
             </w:r>
           </w:p>
         </w:tc>
@@ -2331,8 +2977,30 @@
               <w:rPr>
                 <w:rFonts w:ascii="Tahoma" w:hAnsi="Tahoma" w:cs="Tahoma"/>
               </w:rPr>
-              <w:t>Other expenses by agency</w:t>
-            </w:r>
+              <w:t xml:space="preserve">Other expenses </w:t>
+            </w:r>
+            <w:proofErr w:type="spellStart"/>
+            <w:r>
+              <w:rPr>
+                <w:rFonts w:ascii="Tahoma" w:hAnsi="Tahoma" w:cs="Tahoma"/>
+              </w:rPr>
+              <w:t>by</w:t>
+            </w:r>
+            <w:proofErr w:type="spellEnd"/>
+            <w:r>
+              <w:rPr>
+                <w:rFonts w:ascii="Tahoma" w:hAnsi="Tahoma" w:cs="Tahoma"/>
+              </w:rPr>
+              <w:t xml:space="preserve"> </w:t>
+            </w:r>
+            <w:proofErr w:type="spellStart"/>
+            <w:r>
+              <w:rPr>
+                <w:rFonts w:ascii="Tahoma" w:hAnsi="Tahoma" w:cs="Tahoma"/>
+              </w:rPr>
+              <w:t>agency</w:t>
+            </w:r>
+            <w:proofErr w:type="spellEnd"/>
           </w:p>
         </w:tc>
       </w:tr>
@@ -2471,7 +3139,29 @@
           <w:sz w:val="19"/>
           <w:szCs w:val="19"/>
         </w:rPr>
-        <w:t>{%p if notas %}</w:t>
+        <w:t xml:space="preserve">{%p </w:t>
+      </w:r>
+      <w:proofErr w:type="spellStart"/>
+      <w:r>
+        <w:rPr>
+          <w:rFonts w:ascii="Tahoma" w:hAnsi="Tahoma" w:cs="Tahoma"/>
+          <w:b/>
+          <w:bCs/>
+          <w:sz w:val="19"/>
+          <w:szCs w:val="19"/>
+        </w:rPr>
+        <w:t>if</w:t>
+      </w:r>
+      <w:proofErr w:type="spellEnd"/>
+      <w:r>
+        <w:rPr>
+          <w:rFonts w:ascii="Tahoma" w:hAnsi="Tahoma" w:cs="Tahoma"/>
+          <w:b/>
+          <w:bCs/>
+          <w:sz w:val="19"/>
+          <w:szCs w:val="19"/>
+        </w:rPr>
+        <w:t xml:space="preserve"> notas %}</w:t>
       </w:r>
     </w:p>
     <w:p>
@@ -2533,7 +3223,29 @@
           <w:sz w:val="19"/>
           <w:szCs w:val="19"/>
         </w:rPr>
-        <w:t>{%p endif %}</w:t>
+        <w:t xml:space="preserve">{%p </w:t>
+      </w:r>
+      <w:proofErr w:type="spellStart"/>
+      <w:r>
+        <w:rPr>
+          <w:rFonts w:ascii="Tahoma" w:hAnsi="Tahoma" w:cs="Tahoma"/>
+          <w:b/>
+          <w:bCs/>
+          <w:sz w:val="19"/>
+          <w:szCs w:val="19"/>
+        </w:rPr>
+        <w:t>endif</w:t>
+      </w:r>
+      <w:proofErr w:type="spellEnd"/>
+      <w:r>
+        <w:rPr>
+          <w:rFonts w:ascii="Tahoma" w:hAnsi="Tahoma" w:cs="Tahoma"/>
+          <w:b/>
+          <w:bCs/>
+          <w:sz w:val="19"/>
+          <w:szCs w:val="19"/>
+        </w:rPr>
+        <w:t xml:space="preserve"> %}</w:t>
       </w:r>
     </w:p>
     <w:p>
@@ -2545,11 +3257,33 @@
           <w:rFonts w:ascii="Tahoma" w:hAnsi="Tahoma" w:cs="Tahoma"/>
         </w:rPr>
       </w:pPr>
+      <w:proofErr w:type="spellStart"/>
       <w:r>
         <w:rPr>
           <w:rFonts w:ascii="Tahoma" w:hAnsi="Tahoma" w:cs="Tahoma"/>
         </w:rPr>
-        <w:t>Yours faithfully,</w:t>
+        <w:t>Yours</w:t>
+      </w:r>
+      <w:proofErr w:type="spellEnd"/>
+      <w:r>
+        <w:rPr>
+          <w:rFonts w:ascii="Tahoma" w:hAnsi="Tahoma" w:cs="Tahoma"/>
+        </w:rPr>
+        <w:t xml:space="preserve"> </w:t>
+      </w:r>
+      <w:proofErr w:type="spellStart"/>
+      <w:r>
+        <w:rPr>
+          <w:rFonts w:ascii="Tahoma" w:hAnsi="Tahoma" w:cs="Tahoma"/>
+        </w:rPr>
+        <w:t>faithfully</w:t>
+      </w:r>
+      <w:proofErr w:type="spellEnd"/>
+      <w:r>
+        <w:rPr>
+          <w:rFonts w:ascii="Tahoma" w:hAnsi="Tahoma" w:cs="Tahoma"/>
+        </w:rPr>
+        <w:t>,</w:t>
       </w:r>
     </w:p>
     <w:p>
@@ -2597,8 +3331,30 @@
         <w:rPr>
           <w:rFonts w:ascii="Tahoma" w:hAnsi="Tahoma" w:cs="Tahoma"/>
         </w:rPr>
-        <w:t>{{firmante_email}}</w:t>
+        <w:t>{{</w:t>
       </w:r>
+      <w:proofErr w:type="spellStart"/>
+      <w:r>
+        <w:rPr>
+          <w:rFonts w:ascii="Tahoma" w:hAnsi="Tahoma" w:cs="Tahoma"/>
+        </w:rPr>
+        <w:t>firmante_email</w:t>
+      </w:r>
+      <w:proofErr w:type="spellEnd"/>
+      <w:r>
+        <w:rPr>
+          <w:rFonts w:ascii="Tahoma" w:hAnsi="Tahoma" w:cs="Tahoma"/>
+        </w:rPr>
+        <w:t>}}</w:t>
+      </w:r>
+    </w:p>
+    <w:p>
+      <w:pPr>
+        <w:spacing w:before="240" w:after="90"/>
+        <w:rPr>
+          <w:rFonts w:ascii="Tahoma" w:hAnsi="Tahoma" w:cs="Tahoma"/>
+        </w:rPr>
+      </w:pPr>
     </w:p>
     <w:sectPr>
       <w:headerReference w:type="default" r:id="rId8"/>
@@ -2613,7 +3369,7 @@
 </file>
 
 <file path=word/endnotes.xml><?xml version="1.0" encoding="utf-8"?>
-<w:endnotes xmlns:wpc="http://schemas.microsoft.com/office/word/2010/wordprocessingCanvas" xmlns:cx="http://schemas.microsoft.com/office/drawing/2014/chartex" xmlns:cx1="http://schemas.microsoft.com/office/drawing/2015/9/8/chartex" xmlns:cx2="http://schemas.microsoft.com/office/drawing/2015/10/21/chartex" xmlns:cx3="http://schemas.microsoft.com/office/drawing/2016/5/9/chartex" xmlns:cx4="http://schemas.microsoft.com/office/drawing/2016/5/10/chartex" xmlns:cx5="http://schemas.microsoft.com/office/drawing/2016/5/11/chartex" xmlns:cx6="http://schemas.microsoft.com/office/drawing/2016/5/12/chartex" xmlns:cx7="http://schemas.microsoft.com/office/drawing/2016/5/13/chartex" xmlns:cx8="http://schemas.microsoft.com/office/drawing/2016/5/14/chartex" xmlns:mc="http://schemas.openxmlformats.org/markup-compatibility/2006" xmlns:aink="http://schemas.microsoft.com/office/drawing/2016/ink" xmlns:am3d="http://schemas.microsoft.com/office/drawing/2017/model3d" xmlns:o="urn:schemas-microsoft-com:office:office" xmlns:r="http://schemas.openxmlformats.org/officeDocument/2006/relationships" xmlns:m="http://schemas.openxmlformats.org/officeDocument/2006/math" xmlns:v="urn:schemas-microsoft-com:vml" xmlns:wp14="http://schemas.microsoft.com/office/word/2010/wordprocessingDrawing" xmlns:wp="http://schemas.openxmlformats.org/drawingml/2006/wordprocessingDrawing" xmlns:w10="urn:schemas-microsoft-com:office:word" xmlns:w="http://schemas.openxmlformats.org/wordprocessingml/2006/main" xmlns:w14="http://schemas.microsoft.com/office/word/2010/wordml" xmlns:w15="http://schemas.microsoft.com/office/word/2012/wordml" xmlns:w16cex="http://schemas.microsoft.com/office/word/2018/wordml/cex" xmlns:w16cid="http://schemas.microsoft.com/office/word/2016/wordml/cid" xmlns:w16="http://schemas.microsoft.com/office/word/2018/wordml" xmlns:w16sdtdh="http://schemas.microsoft.com/office/word/2020/wordml/sdtdatahash" xmlns:w16se="http://schemas.microsoft.com/office/word/2015/wordml/symex" xmlns:wpg="http://schemas.microsoft.com/office/word/2010/wordprocessingGroup" xmlns:wpi="http://schemas.microsoft.com/office/word/2010/wordprocessingInk" xmlns:wne="http://schemas.microsoft.com/office/word/2006/wordml" xmlns:wps="http://schemas.microsoft.com/office/word/2010/wordprocessingShape" mc:Ignorable="w14 w15 w16se w16cid w16 w16cex w16sdtdh wp14">
+<w:endnotes xmlns:wpc="http://schemas.microsoft.com/office/word/2010/wordprocessingCanvas" xmlns:cx="http://schemas.microsoft.com/office/drawing/2014/chartex" xmlns:cx1="http://schemas.microsoft.com/office/drawing/2015/9/8/chartex" xmlns:cx2="http://schemas.microsoft.com/office/drawing/2015/10/21/chartex" xmlns:cx3="http://schemas.microsoft.com/office/drawing/2016/5/9/chartex" xmlns:cx4="http://schemas.microsoft.com/office/drawing/2016/5/10/chartex" xmlns:cx5="http://schemas.microsoft.com/office/drawing/2016/5/11/chartex" xmlns:cx6="http://schemas.microsoft.com/office/drawing/2016/5/12/chartex" xmlns:cx7="http://schemas.microsoft.com/office/drawing/2016/5/13/chartex" xmlns:cx8="http://schemas.microsoft.com/office/drawing/2016/5/14/chartex" xmlns:mc="http://schemas.openxmlformats.org/markup-compatibility/2006" xmlns:aink="http://schemas.microsoft.com/office/drawing/2016/ink" xmlns:am3d="http://schemas.microsoft.com/office/drawing/2017/model3d" xmlns:o="urn:schemas-microsoft-com:office:office" xmlns:oel="http://schemas.microsoft.com/office/2019/extlst" xmlns:r="http://schemas.openxmlformats.org/officeDocument/2006/relationships" xmlns:m="http://schemas.openxmlformats.org/officeDocument/2006/math" xmlns:v="urn:schemas-microsoft-com:vml" xmlns:wp14="http://schemas.microsoft.com/office/word/2010/wordprocessingDrawing" xmlns:wp="http://schemas.openxmlformats.org/drawingml/2006/wordprocessingDrawing" xmlns:w10="urn:schemas-microsoft-com:office:word" xmlns:w="http://schemas.openxmlformats.org/wordprocessingml/2006/main" xmlns:w14="http://schemas.microsoft.com/office/word/2010/wordml" xmlns:w15="http://schemas.microsoft.com/office/word/2012/wordml" xmlns:w16cex="http://schemas.microsoft.com/office/word/2018/wordml/cex" xmlns:w16cid="http://schemas.microsoft.com/office/word/2016/wordml/cid" xmlns:w16="http://schemas.microsoft.com/office/word/2018/wordml" xmlns:w16du="http://schemas.microsoft.com/office/word/2023/wordml/word16du" xmlns:w16sdtdh="http://schemas.microsoft.com/office/word/2020/wordml/sdtdatahash" xmlns:w16sdtfl="http://schemas.microsoft.com/office/word/2024/wordml/sdtformatlock" xmlns:w16se="http://schemas.microsoft.com/office/word/2015/wordml/symex" xmlns:wpg="http://schemas.microsoft.com/office/word/2010/wordprocessingGroup" xmlns:wpi="http://schemas.microsoft.com/office/word/2010/wordprocessingInk" xmlns:wne="http://schemas.microsoft.com/office/word/2006/wordml" xmlns:wps="http://schemas.microsoft.com/office/word/2010/wordprocessingShape" mc:Ignorable="w14 w15 w16se w16cid w16 w16cex w16sdtdh w16sdtfl w16du wp14">
   <w:endnote w:type="separator" w:id="-1">
     <w:p>
       <w:r>
@@ -2632,7 +3388,7 @@
 </file>
 
 <file path=word/footer1.xml><?xml version="1.0" encoding="utf-8"?>
-<w:ftr xmlns:wpc="http://schemas.microsoft.com/office/word/2010/wordprocessingCanvas" xmlns:cx="http://schemas.microsoft.com/office/drawing/2014/chartex" xmlns:cx1="http://schemas.microsoft.com/office/drawing/2015/9/8/chartex" xmlns:cx2="http://schemas.microsoft.com/office/drawing/2015/10/21/chartex" xmlns:cx3="http://schemas.microsoft.com/office/drawing/2016/5/9/chartex" xmlns:cx4="http://schemas.microsoft.com/office/drawing/2016/5/10/chartex" xmlns:cx5="http://schemas.microsoft.com/office/drawing/2016/5/11/chartex" xmlns:cx6="http://schemas.microsoft.com/office/drawing/2016/5/12/chartex" xmlns:cx7="http://schemas.microsoft.com/office/drawing/2016/5/13/chartex" xmlns:cx8="http://schemas.microsoft.com/office/drawing/2016/5/14/chartex" xmlns:mc="http://schemas.openxmlformats.org/markup-compatibility/2006" xmlns:aink="http://schemas.microsoft.com/office/drawing/2016/ink" xmlns:am3d="http://schemas.microsoft.com/office/drawing/2017/model3d" xmlns:o="urn:schemas-microsoft-com:office:office" xmlns:r="http://schemas.openxmlformats.org/officeDocument/2006/relationships" xmlns:m="http://schemas.openxmlformats.org/officeDocument/2006/math" xmlns:v="urn:schemas-microsoft-com:vml" xmlns:wp14="http://schemas.microsoft.com/office/word/2010/wordprocessingDrawing" xmlns:wp="http://schemas.openxmlformats.org/drawingml/2006/wordprocessingDrawing" xmlns:w10="urn:schemas-microsoft-com:office:word" xmlns:w="http://schemas.openxmlformats.org/wordprocessingml/2006/main" xmlns:w14="http://schemas.microsoft.com/office/word/2010/wordml" xmlns:w15="http://schemas.microsoft.com/office/word/2012/wordml" xmlns:w16cex="http://schemas.microsoft.com/office/word/2018/wordml/cex" xmlns:w16cid="http://schemas.microsoft.com/office/word/2016/wordml/cid" xmlns:w16="http://schemas.microsoft.com/office/word/2018/wordml" xmlns:w16sdtdh="http://schemas.microsoft.com/office/word/2020/wordml/sdtdatahash" xmlns:w16se="http://schemas.microsoft.com/office/word/2015/wordml/symex" xmlns:wpg="http://schemas.microsoft.com/office/word/2010/wordprocessingGroup" xmlns:wpi="http://schemas.microsoft.com/office/word/2010/wordprocessingInk" xmlns:wne="http://schemas.microsoft.com/office/word/2006/wordml" xmlns:wps="http://schemas.microsoft.com/office/word/2010/wordprocessingShape" mc:Ignorable="w14 w15 w16se w16cid w16 w16cex w16sdtdh wp14">
+<w:ftr xmlns:wpc="http://schemas.microsoft.com/office/word/2010/wordprocessingCanvas" xmlns:cx="http://schemas.microsoft.com/office/drawing/2014/chartex" xmlns:cx1="http://schemas.microsoft.com/office/drawing/2015/9/8/chartex" xmlns:cx2="http://schemas.microsoft.com/office/drawing/2015/10/21/chartex" xmlns:cx3="http://schemas.microsoft.com/office/drawing/2016/5/9/chartex" xmlns:cx4="http://schemas.microsoft.com/office/drawing/2016/5/10/chartex" xmlns:cx5="http://schemas.microsoft.com/office/drawing/2016/5/11/chartex" xmlns:cx6="http://schemas.microsoft.com/office/drawing/2016/5/12/chartex" xmlns:cx7="http://schemas.microsoft.com/office/drawing/2016/5/13/chartex" xmlns:cx8="http://schemas.microsoft.com/office/drawing/2016/5/14/chartex" xmlns:mc="http://schemas.openxmlformats.org/markup-compatibility/2006" xmlns:aink="http://schemas.microsoft.com/office/drawing/2016/ink" xmlns:am3d="http://schemas.microsoft.com/office/drawing/2017/model3d" xmlns:o="urn:schemas-microsoft-com:office:office" xmlns:oel="http://schemas.microsoft.com/office/2019/extlst" xmlns:r="http://schemas.openxmlformats.org/officeDocument/2006/relationships" xmlns:m="http://schemas.openxmlformats.org/officeDocument/2006/math" xmlns:v="urn:schemas-microsoft-com:vml" xmlns:wp14="http://schemas.microsoft.com/office/word/2010/wordprocessingDrawing" xmlns:wp="http://schemas.openxmlformats.org/drawingml/2006/wordprocessingDrawing" xmlns:w10="urn:schemas-microsoft-com:office:word" xmlns:w="http://schemas.openxmlformats.org/wordprocessingml/2006/main" xmlns:w14="http://schemas.microsoft.com/office/word/2010/wordml" xmlns:w15="http://schemas.microsoft.com/office/word/2012/wordml" xmlns:w16cex="http://schemas.microsoft.com/office/word/2018/wordml/cex" xmlns:w16cid="http://schemas.microsoft.com/office/word/2016/wordml/cid" xmlns:w16="http://schemas.microsoft.com/office/word/2018/wordml" xmlns:w16du="http://schemas.microsoft.com/office/word/2023/wordml/word16du" xmlns:w16sdtdh="http://schemas.microsoft.com/office/word/2020/wordml/sdtdatahash" xmlns:w16sdtfl="http://schemas.microsoft.com/office/word/2024/wordml/sdtformatlock" xmlns:w16se="http://schemas.microsoft.com/office/word/2015/wordml/symex" xmlns:wpg="http://schemas.microsoft.com/office/word/2010/wordprocessingGroup" xmlns:wpi="http://schemas.microsoft.com/office/word/2010/wordprocessingInk" xmlns:wne="http://schemas.microsoft.com/office/word/2006/wordml" xmlns:wps="http://schemas.microsoft.com/office/word/2010/wordprocessingShape" mc:Ignorable="w14 w15 w16se w16cid w16 w16cex w16sdtdh w16sdtfl w16du wp14">
   <w:p>
     <w:pPr>
       <w:pBdr>
@@ -2647,7 +3403,55 @@
         <w:sz w:val="14"/>
         <w:szCs w:val="14"/>
       </w:rPr>
-      <w:t>Proios S.A. · Comodoro Pedro Zanni 351, 5th Fl. – 503 LN, Buenos Aires (C1104AAH)  ·  info@proios.com  ·  www.proios.com</w:t>
+      <w:t xml:space="preserve">Proios S.A. · Comodoro Pedro Zanni 351, 5th </w:t>
+    </w:r>
+    <w:proofErr w:type="spellStart"/>
+    <w:r>
+      <w:rPr>
+        <w:sz w:val="14"/>
+        <w:szCs w:val="14"/>
+      </w:rPr>
+      <w:t>Fl</w:t>
+    </w:r>
+    <w:proofErr w:type="spellEnd"/>
+    <w:r>
+      <w:rPr>
+        <w:sz w:val="14"/>
+        <w:szCs w:val="14"/>
+      </w:rPr>
+      <w:t>. – 503 LN, Buenos Aires (C1104</w:t>
+    </w:r>
+    <w:proofErr w:type="gramStart"/>
+    <w:r>
+      <w:rPr>
+        <w:sz w:val="14"/>
+        <w:szCs w:val="14"/>
+      </w:rPr>
+      <w:t>AAH)  ·</w:t>
+    </w:r>
+    <w:proofErr w:type="gramEnd"/>
+    <w:r>
+      <w:rPr>
+        <w:sz w:val="14"/>
+        <w:szCs w:val="14"/>
+      </w:rPr>
+      <w:t xml:space="preserve">  </w:t>
+    </w:r>
+    <w:proofErr w:type="gramStart"/>
+    <w:r>
+      <w:rPr>
+        <w:sz w:val="14"/>
+        <w:szCs w:val="14"/>
+      </w:rPr>
+      <w:t>info@proios.com  ·</w:t>
+    </w:r>
+    <w:proofErr w:type="gramEnd"/>
+    <w:r>
+      <w:rPr>
+        <w:sz w:val="14"/>
+        <w:szCs w:val="14"/>
+      </w:rPr>
+      <w:t xml:space="preserve">  www.proios.com</w:t>
     </w:r>
     <w:r>
       <w:rPr>
@@ -2698,7 +3502,7 @@
 </file>
 
 <file path=word/footnotes.xml><?xml version="1.0" encoding="utf-8"?>
-<w:footnotes xmlns:wpc="http://schemas.microsoft.com/office/word/2010/wordprocessingCanvas" xmlns:cx="http://schemas.microsoft.com/office/drawing/2014/chartex" xmlns:cx1="http://schemas.microsoft.com/office/drawing/2015/9/8/chartex" xmlns:cx2="http://schemas.microsoft.com/office/drawing/2015/10/21/chartex" xmlns:cx3="http://schemas.microsoft.com/office/drawing/2016/5/9/chartex" xmlns:cx4="http://schemas.microsoft.com/office/drawing/2016/5/10/chartex" xmlns:cx5="http://schemas.microsoft.com/office/drawing/2016/5/11/chartex" xmlns:cx6="http://schemas.microsoft.com/office/drawing/2016/5/12/chartex" xmlns:cx7="http://schemas.microsoft.com/office/drawing/2016/5/13/chartex" xmlns:cx8="http://schemas.microsoft.com/office/drawing/2016/5/14/chartex" xmlns:mc="http://schemas.openxmlformats.org/markup-compatibility/2006" xmlns:aink="http://schemas.microsoft.com/office/drawing/2016/ink" xmlns:am3d="http://schemas.microsoft.com/office/drawing/2017/model3d" xmlns:o="urn:schemas-microsoft-com:office:office" xmlns:r="http://schemas.openxmlformats.org/officeDocument/2006/relationships" xmlns:m="http://schemas.openxmlformats.org/officeDocument/2006/math" xmlns:v="urn:schemas-microsoft-com:vml" xmlns:wp14="http://schemas.microsoft.com/office/word/2010/wordprocessingDrawing" xmlns:wp="http://schemas.openxmlformats.org/drawingml/2006/wordprocessingDrawing" xmlns:w10="urn:schemas-microsoft-com:office:word" xmlns:w="http://schemas.openxmlformats.org/wordprocessingml/2006/main" xmlns:w14="http://schemas.microsoft.com/office/word/2010/wordml" xmlns:w15="http://schemas.microsoft.com/office/word/2012/wordml" xmlns:w16cex="http://schemas.microsoft.com/office/word/2018/wordml/cex" xmlns:w16cid="http://schemas.microsoft.com/office/word/2016/wordml/cid" xmlns:w16="http://schemas.microsoft.com/office/word/2018/wordml" xmlns:w16sdtdh="http://schemas.microsoft.com/office/word/2020/wordml/sdtdatahash" xmlns:w16se="http://schemas.microsoft.com/office/word/2015/wordml/symex" xmlns:wpg="http://schemas.microsoft.com/office/word/2010/wordprocessingGroup" xmlns:wpi="http://schemas.microsoft.com/office/word/2010/wordprocessingInk" xmlns:wne="http://schemas.microsoft.com/office/word/2006/wordml" xmlns:wps="http://schemas.microsoft.com/office/word/2010/wordprocessingShape" mc:Ignorable="w14 w15 w16se w16cid w16 w16cex w16sdtdh wp14">
+<w:footnotes xmlns:wpc="http://schemas.microsoft.com/office/word/2010/wordprocessingCanvas" xmlns:cx="http://schemas.microsoft.com/office/drawing/2014/chartex" xmlns:cx1="http://schemas.microsoft.com/office/drawing/2015/9/8/chartex" xmlns:cx2="http://schemas.microsoft.com/office/drawing/2015/10/21/chartex" xmlns:cx3="http://schemas.microsoft.com/office/drawing/2016/5/9/chartex" xmlns:cx4="http://schemas.microsoft.com/office/drawing/2016/5/10/chartex" xmlns:cx5="http://schemas.microsoft.com/office/drawing/2016/5/11/chartex" xmlns:cx6="http://schemas.microsoft.com/office/drawing/2016/5/12/chartex" xmlns:cx7="http://schemas.microsoft.com/office/drawing/2016/5/13/chartex" xmlns:cx8="http://schemas.microsoft.com/office/drawing/2016/5/14/chartex" xmlns:mc="http://schemas.openxmlformats.org/markup-compatibility/2006" xmlns:aink="http://schemas.microsoft.com/office/drawing/2016/ink" xmlns:am3d="http://schemas.microsoft.com/office/drawing/2017/model3d" xmlns:o="urn:schemas-microsoft-com:office:office" xmlns:oel="http://schemas.microsoft.com/office/2019/extlst" xmlns:r="http://schemas.openxmlformats.org/officeDocument/2006/relationships" xmlns:m="http://schemas.openxmlformats.org/officeDocument/2006/math" xmlns:v="urn:schemas-microsoft-com:vml" xmlns:wp14="http://schemas.microsoft.com/office/word/2010/wordprocessingDrawing" xmlns:wp="http://schemas.openxmlformats.org/drawingml/2006/wordprocessingDrawing" xmlns:w10="urn:schemas-microsoft-com:office:word" xmlns:w="http://schemas.openxmlformats.org/wordprocessingml/2006/main" xmlns:w14="http://schemas.microsoft.com/office/word/2010/wordml" xmlns:w15="http://schemas.microsoft.com/office/word/2012/wordml" xmlns:w16cex="http://schemas.microsoft.com/office/word/2018/wordml/cex" xmlns:w16cid="http://schemas.microsoft.com/office/word/2016/wordml/cid" xmlns:w16="http://schemas.microsoft.com/office/word/2018/wordml" xmlns:w16du="http://schemas.microsoft.com/office/word/2023/wordml/word16du" xmlns:w16sdtdh="http://schemas.microsoft.com/office/word/2020/wordml/sdtdatahash" xmlns:w16sdtfl="http://schemas.microsoft.com/office/word/2024/wordml/sdtformatlock" xmlns:w16se="http://schemas.microsoft.com/office/word/2015/wordml/symex" xmlns:wpg="http://schemas.microsoft.com/office/word/2010/wordprocessingGroup" xmlns:wpi="http://schemas.microsoft.com/office/word/2010/wordprocessingInk" xmlns:wne="http://schemas.microsoft.com/office/word/2006/wordml" xmlns:wps="http://schemas.microsoft.com/office/word/2010/wordprocessingShape" mc:Ignorable="w14 w15 w16se w16cid w16 w16cex w16sdtdh w16sdtfl w16du wp14">
   <w:footnote w:type="separator" w:id="-1">
     <w:p>
       <w:r>
@@ -2717,7 +3521,7 @@
 </file>
 
 <file path=word/header1.xml><?xml version="1.0" encoding="utf-8"?>
-<w:hdr xmlns:wpc="http://schemas.microsoft.com/office/word/2010/wordprocessingCanvas" xmlns:cx="http://schemas.microsoft.com/office/drawing/2014/chartex" xmlns:cx1="http://schemas.microsoft.com/office/drawing/2015/9/8/chartex" xmlns:cx2="http://schemas.microsoft.com/office/drawing/2015/10/21/chartex" xmlns:cx3="http://schemas.microsoft.com/office/drawing/2016/5/9/chartex" xmlns:cx4="http://schemas.microsoft.com/office/drawing/2016/5/10/chartex" xmlns:cx5="http://schemas.microsoft.com/office/drawing/2016/5/11/chartex" xmlns:cx6="http://schemas.microsoft.com/office/drawing/2016/5/12/chartex" xmlns:cx7="http://schemas.microsoft.com/office/drawing/2016/5/13/chartex" xmlns:cx8="http://schemas.microsoft.com/office/drawing/2016/5/14/chartex" xmlns:mc="http://schemas.openxmlformats.org/markup-compatibility/2006" xmlns:aink="http://schemas.microsoft.com/office/drawing/2016/ink" xmlns:am3d="http://schemas.microsoft.com/office/drawing/2017/model3d" xmlns:o="urn:schemas-microsoft-com:office:office" xmlns:r="http://schemas.openxmlformats.org/officeDocument/2006/relationships" xmlns:m="http://schemas.openxmlformats.org/officeDocument/2006/math" xmlns:v="urn:schemas-microsoft-com:vml" xmlns:wp14="http://schemas.microsoft.com/office/word/2010/wordprocessingDrawing" xmlns:wp="http://schemas.openxmlformats.org/drawingml/2006/wordprocessingDrawing" xmlns:w10="urn:schemas-microsoft-com:office:word" xmlns:w="http://schemas.openxmlformats.org/wordprocessingml/2006/main" xmlns:w14="http://schemas.microsoft.com/office/word/2010/wordml" xmlns:w15="http://schemas.microsoft.com/office/word/2012/wordml" xmlns:w16cex="http://schemas.microsoft.com/office/word/2018/wordml/cex" xmlns:w16cid="http://schemas.microsoft.com/office/word/2016/wordml/cid" xmlns:w16="http://schemas.microsoft.com/office/word/2018/wordml" xmlns:w16sdtdh="http://schemas.microsoft.com/office/word/2020/wordml/sdtdatahash" xmlns:w16se="http://schemas.microsoft.com/office/word/2015/wordml/symex" xmlns:wpg="http://schemas.microsoft.com/office/word/2010/wordprocessingGroup" xmlns:wpi="http://schemas.microsoft.com/office/word/2010/wordprocessingInk" xmlns:wne="http://schemas.microsoft.com/office/word/2006/wordml" xmlns:wps="http://schemas.microsoft.com/office/word/2010/wordprocessingShape" mc:Ignorable="w14 w15 w16se w16cid w16 w16cex w16sdtdh wp14">
+<w:hdr xmlns:wpc="http://schemas.microsoft.com/office/word/2010/wordprocessingCanvas" xmlns:cx="http://schemas.microsoft.com/office/drawing/2014/chartex" xmlns:cx1="http://schemas.microsoft.com/office/drawing/2015/9/8/chartex" xmlns:cx2="http://schemas.microsoft.com/office/drawing/2015/10/21/chartex" xmlns:cx3="http://schemas.microsoft.com/office/drawing/2016/5/9/chartex" xmlns:cx4="http://schemas.microsoft.com/office/drawing/2016/5/10/chartex" xmlns:cx5="http://schemas.microsoft.com/office/drawing/2016/5/11/chartex" xmlns:cx6="http://schemas.microsoft.com/office/drawing/2016/5/12/chartex" xmlns:cx7="http://schemas.microsoft.com/office/drawing/2016/5/13/chartex" xmlns:cx8="http://schemas.microsoft.com/office/drawing/2016/5/14/chartex" xmlns:mc="http://schemas.openxmlformats.org/markup-compatibility/2006" xmlns:aink="http://schemas.microsoft.com/office/drawing/2016/ink" xmlns:am3d="http://schemas.microsoft.com/office/drawing/2017/model3d" xmlns:o="urn:schemas-microsoft-com:office:office" xmlns:oel="http://schemas.microsoft.com/office/2019/extlst" xmlns:r="http://schemas.openxmlformats.org/officeDocument/2006/relationships" xmlns:m="http://schemas.openxmlformats.org/officeDocument/2006/math" xmlns:v="urn:schemas-microsoft-com:vml" xmlns:wp14="http://schemas.microsoft.com/office/word/2010/wordprocessingDrawing" xmlns:wp="http://schemas.openxmlformats.org/drawingml/2006/wordprocessingDrawing" xmlns:w10="urn:schemas-microsoft-com:office:word" xmlns:w="http://schemas.openxmlformats.org/wordprocessingml/2006/main" xmlns:w14="http://schemas.microsoft.com/office/word/2010/wordml" xmlns:w15="http://schemas.microsoft.com/office/word/2012/wordml" xmlns:w16cex="http://schemas.microsoft.com/office/word/2018/wordml/cex" xmlns:w16cid="http://schemas.microsoft.com/office/word/2016/wordml/cid" xmlns:w16="http://schemas.microsoft.com/office/word/2018/wordml" xmlns:w16du="http://schemas.microsoft.com/office/word/2023/wordml/word16du" xmlns:w16sdtdh="http://schemas.microsoft.com/office/word/2020/wordml/sdtdatahash" xmlns:w16sdtfl="http://schemas.microsoft.com/office/word/2024/wordml/sdtformatlock" xmlns:w16se="http://schemas.microsoft.com/office/word/2015/wordml/symex" xmlns:wpg="http://schemas.microsoft.com/office/word/2010/wordprocessingGroup" xmlns:wpi="http://schemas.microsoft.com/office/word/2010/wordprocessingInk" xmlns:wne="http://schemas.microsoft.com/office/word/2006/wordml" xmlns:wps="http://schemas.microsoft.com/office/word/2010/wordprocessingShape" mc:Ignorable="w14 w15 w16se w16cid w16 w16cex w16sdtdh w16sdtfl w16du wp14">
   <w:tbl>
     <w:tblPr>
       <w:tblW w:w="9360" w:type="dxa"/>
@@ -2734,7 +3538,6 @@
     <w:tr>
       <w:trPr>
         <w:trHeight w:hRule="exact" w:val="2410"/>
-        <w:tblHeader/>
       </w:trPr>
       <w:tc>
         <w:tcPr>
@@ -2747,11 +3550,7 @@
           </w:tcMar>
           <w:vAlign w:val="bottom"/>
         </w:tcPr>
-        <w:p>
-          <w:pPr>
-            <w:contextualSpacing/>
-          </w:pPr>
-        </w:p>
+        <w:p/>
       </w:tc>
       <w:tc>
         <w:tcPr>
@@ -2827,7 +3626,7 @@
 </file>
 
 <file path=word/numbering.xml><?xml version="1.0" encoding="utf-8"?>
-<w:numbering xmlns:wpc="http://schemas.microsoft.com/office/word/2010/wordprocessingCanvas" xmlns:cx="http://schemas.microsoft.com/office/drawing/2014/chartex" xmlns:cx1="http://schemas.microsoft.com/office/drawing/2015/9/8/chartex" xmlns:cx2="http://schemas.microsoft.com/office/drawing/2015/10/21/chartex" xmlns:cx3="http://schemas.microsoft.com/office/drawing/2016/5/9/chartex" xmlns:cx4="http://schemas.microsoft.com/office/drawing/2016/5/10/chartex" xmlns:cx5="http://schemas.microsoft.com/office/drawing/2016/5/11/chartex" xmlns:cx6="http://schemas.microsoft.com/office/drawing/2016/5/12/chartex" xmlns:cx7="http://schemas.microsoft.com/office/drawing/2016/5/13/chartex" xmlns:cx8="http://schemas.microsoft.com/office/drawing/2016/5/14/chartex" xmlns:mc="http://schemas.openxmlformats.org/markup-compatibility/2006" xmlns:aink="http://schemas.microsoft.com/office/drawing/2016/ink" xmlns:am3d="http://schemas.microsoft.com/office/drawing/2017/model3d" xmlns:o="urn:schemas-microsoft-com:office:office" xmlns:r="http://schemas.openxmlformats.org/officeDocument/2006/relationships" xmlns:m="http://schemas.openxmlformats.org/officeDocument/2006/math" xmlns:v="urn:schemas-microsoft-com:vml" xmlns:wp14="http://schemas.microsoft.com/office/word/2010/wordprocessingDrawing" xmlns:wp="http://schemas.openxmlformats.org/drawingml/2006/wordprocessingDrawing" xmlns:w10="urn:schemas-microsoft-com:office:word" xmlns:w="http://schemas.openxmlformats.org/wordprocessingml/2006/main" xmlns:w14="http://schemas.microsoft.com/office/word/2010/wordml" xmlns:w15="http://schemas.microsoft.com/office/word/2012/wordml" xmlns:w16cex="http://schemas.microsoft.com/office/word/2018/wordml/cex" xmlns:w16cid="http://schemas.microsoft.com/office/word/2016/wordml/cid" xmlns:w16="http://schemas.microsoft.com/office/word/2018/wordml" xmlns:w16sdtdh="http://schemas.microsoft.com/office/word/2020/wordml/sdtdatahash" xmlns:w16se="http://schemas.microsoft.com/office/word/2015/wordml/symex" xmlns:wpg="http://schemas.microsoft.com/office/word/2010/wordprocessingGroup" xmlns:wpi="http://schemas.microsoft.com/office/word/2010/wordprocessingInk" xmlns:wne="http://schemas.microsoft.com/office/word/2006/wordml" xmlns:wps="http://schemas.microsoft.com/office/word/2010/wordprocessingShape" mc:Ignorable="w14 w15 w16se w16cid w16 w16cex w16sdtdh wp14">
+<w:numbering xmlns:wpc="http://schemas.microsoft.com/office/word/2010/wordprocessingCanvas" xmlns:cx="http://schemas.microsoft.com/office/drawing/2014/chartex" xmlns:cx1="http://schemas.microsoft.com/office/drawing/2015/9/8/chartex" xmlns:cx2="http://schemas.microsoft.com/office/drawing/2015/10/21/chartex" xmlns:cx3="http://schemas.microsoft.com/office/drawing/2016/5/9/chartex" xmlns:cx4="http://schemas.microsoft.com/office/drawing/2016/5/10/chartex" xmlns:cx5="http://schemas.microsoft.com/office/drawing/2016/5/11/chartex" xmlns:cx6="http://schemas.microsoft.com/office/drawing/2016/5/12/chartex" xmlns:cx7="http://schemas.microsoft.com/office/drawing/2016/5/13/chartex" xmlns:cx8="http://schemas.microsoft.com/office/drawing/2016/5/14/chartex" xmlns:mc="http://schemas.openxmlformats.org/markup-compatibility/2006" xmlns:aink="http://schemas.microsoft.com/office/drawing/2016/ink" xmlns:am3d="http://schemas.microsoft.com/office/drawing/2017/model3d" xmlns:o="urn:schemas-microsoft-com:office:office" xmlns:oel="http://schemas.microsoft.com/office/2019/extlst" xmlns:r="http://schemas.openxmlformats.org/officeDocument/2006/relationships" xmlns:m="http://schemas.openxmlformats.org/officeDocument/2006/math" xmlns:v="urn:schemas-microsoft-com:vml" xmlns:wp14="http://schemas.microsoft.com/office/word/2010/wordprocessingDrawing" xmlns:wp="http://schemas.openxmlformats.org/drawingml/2006/wordprocessingDrawing" xmlns:w10="urn:schemas-microsoft-com:office:word" xmlns:w="http://schemas.openxmlformats.org/wordprocessingml/2006/main" xmlns:w14="http://schemas.microsoft.com/office/word/2010/wordml" xmlns:w15="http://schemas.microsoft.com/office/word/2012/wordml" xmlns:w16cex="http://schemas.microsoft.com/office/word/2018/wordml/cex" xmlns:w16cid="http://schemas.microsoft.com/office/word/2016/wordml/cid" xmlns:w16="http://schemas.microsoft.com/office/word/2018/wordml" xmlns:w16du="http://schemas.microsoft.com/office/word/2023/wordml/word16du" xmlns:w16sdtdh="http://schemas.microsoft.com/office/word/2020/wordml/sdtdatahash" xmlns:w16sdtfl="http://schemas.microsoft.com/office/word/2024/wordml/sdtformatlock" xmlns:w16se="http://schemas.microsoft.com/office/word/2015/wordml/symex" xmlns:wpg="http://schemas.microsoft.com/office/word/2010/wordprocessingGroup" xmlns:wpi="http://schemas.microsoft.com/office/word/2010/wordprocessingInk" xmlns:wne="http://schemas.microsoft.com/office/word/2006/wordml" xmlns:wps="http://schemas.microsoft.com/office/word/2010/wordprocessingShape" mc:Ignorable="w14 w15 w16se w16cid w16 w16cex w16sdtdh w16sdtfl w16du wp14">
   <w:abstractNum w:abstractNumId="0" w15:restartNumberingAfterBreak="0">
     <w:nsid w:val="090B0C57"/>
     <w:multiLevelType w:val="hybridMultilevel"/>
@@ -2968,13 +3767,13 @@
       <w:lvlJc w:val="left"/>
     </w:lvl>
   </w:abstractNum>
-  <w:num w:numId="1">
+  <w:num w:numId="1" w16cid:durableId="632904467">
     <w:abstractNumId w:val="0"/>
     <w:lvlOverride w:ilvl="0">
       <w:startOverride w:val="1"/>
     </w:lvlOverride>
   </w:num>
-  <w:num w:numId="2">
+  <w:num w:numId="2" w16cid:durableId="342515125">
     <w:abstractNumId w:val="1"/>
     <w:lvlOverride w:ilvl="0">
       <w:startOverride w:val="1"/>
@@ -2984,7 +3783,7 @@
 </file>
 
 <file path=word/styles.xml><?xml version="1.0" encoding="utf-8"?>
-<w:styles xmlns:mc="http://schemas.openxmlformats.org/markup-compatibility/2006" xmlns:r="http://schemas.openxmlformats.org/officeDocument/2006/relationships" xmlns:w="http://schemas.openxmlformats.org/wordprocessingml/2006/main" xmlns:w14="http://schemas.microsoft.com/office/word/2010/wordml" xmlns:w15="http://schemas.microsoft.com/office/word/2012/wordml" xmlns:w16cex="http://schemas.microsoft.com/office/word/2018/wordml/cex" xmlns:w16cid="http://schemas.microsoft.com/office/word/2016/wordml/cid" xmlns:w16="http://schemas.microsoft.com/office/word/2018/wordml" xmlns:w16sdtdh="http://schemas.microsoft.com/office/word/2020/wordml/sdtdatahash" xmlns:w16se="http://schemas.microsoft.com/office/word/2015/wordml/symex" mc:Ignorable="w14 w15 w16se w16cid w16 w16cex w16sdtdh">
+<w:styles xmlns:mc="http://schemas.openxmlformats.org/markup-compatibility/2006" xmlns:r="http://schemas.openxmlformats.org/officeDocument/2006/relationships" xmlns:w="http://schemas.openxmlformats.org/wordprocessingml/2006/main" xmlns:w14="http://schemas.microsoft.com/office/word/2010/wordml" xmlns:w15="http://schemas.microsoft.com/office/word/2012/wordml" xmlns:w16cex="http://schemas.microsoft.com/office/word/2018/wordml/cex" xmlns:w16cid="http://schemas.microsoft.com/office/word/2016/wordml/cid" xmlns:w16="http://schemas.microsoft.com/office/word/2018/wordml" xmlns:w16du="http://schemas.microsoft.com/office/word/2023/wordml/word16du" xmlns:w16sdtdh="http://schemas.microsoft.com/office/word/2020/wordml/sdtdatahash" xmlns:w16sdtfl="http://schemas.microsoft.com/office/word/2024/wordml/sdtformatlock" xmlns:w16se="http://schemas.microsoft.com/office/word/2015/wordml/symex" mc:Ignorable="w14 w15 w16se w16cid w16 w16cex w16sdtdh w16sdtfl w16du">
   <w:docDefaults>
     <w:rPrDefault>
       <w:rPr>

</xml_diff>